<commit_message>
Paper: wider rectangular author block (PDF and Word)
Co-Authored-By: Claude Opus 5.5 <noreply@anthropic.com>
Claude-Session: https://claude.ai/code/session_012dEQdMZNR7XbfWBwVYyVsn
</commit_message>
<xml_diff>
--- a/docs/paper/AION_paper.docx
+++ b/docs/paper/AION_paper.docx
@@ -22,10 +22,12 @@
         <w:tblW w:type="auto" w:w="0"/>
         <w:jc w:val="center"/>
         <w:tblLook w:firstColumn="1" w:firstRow="1" w:lastColumn="0" w:lastRow="0" w:noHBand="0" w:noVBand="1" w:val="04A0"/>
+        <w:tblLayout w:type="fixed"/>
       </w:tblPr>
       <w:tblGrid>
-        <w:gridCol w:w="4680"/>
-        <w:gridCol w:w="4680"/>
+        <w:gridCol w:w="3744"/>
+        <w:gridCol w:w="2304"/>
+        <w:gridCol w:w="3744"/>
       </w:tblGrid>
       <w:tr>
         <w:tc>
@@ -98,7 +100,7 @@
           </w:p>
           <w:p>
             <w:pPr>
-              <w:spacing w:before="0" w:after="200" w:line="240" w:lineRule="auto"/>
+              <w:spacing w:before="0" w:after="280" w:line="240" w:lineRule="auto"/>
               <w:ind w:firstLine="0"/>
               <w:jc w:val="center"/>
             </w:pPr>
@@ -115,6 +117,12 @@
         </w:tc>
         <w:tc>
           <w:tcPr>
+            <w:tcW w:type="dxa" w:w="2304"/>
+          </w:tcPr>
+          <w:p/>
+        </w:tc>
+        <w:tc>
+          <w:tcPr>
             <w:tcW w:type="dxa" w:w="3744"/>
           </w:tcPr>
           <w:p>
@@ -183,7 +191,7 @@
           </w:p>
           <w:p>
             <w:pPr>
-              <w:spacing w:before="0" w:after="200" w:line="240" w:lineRule="auto"/>
+              <w:spacing w:before="0" w:after="280" w:line="240" w:lineRule="auto"/>
               <w:ind w:firstLine="0"/>
               <w:jc w:val="center"/>
             </w:pPr>
@@ -270,7 +278,7 @@
           </w:p>
           <w:p>
             <w:pPr>
-              <w:spacing w:before="0" w:after="0" w:line="240" w:lineRule="auto"/>
+              <w:spacing w:before="0" w:after="320" w:line="240" w:lineRule="auto"/>
               <w:ind w:firstLine="0"/>
               <w:jc w:val="center"/>
             </w:pPr>
@@ -287,6 +295,12 @@
         </w:tc>
         <w:tc>
           <w:tcPr>
+            <w:tcW w:type="dxa" w:w="2304"/>
+          </w:tcPr>
+          <w:p/>
+        </w:tc>
+        <w:tc>
+          <w:tcPr>
             <w:tcW w:type="dxa" w:w="3744"/>
           </w:tcPr>
           <w:p>
@@ -355,7 +369,7 @@
           </w:p>
           <w:p>
             <w:pPr>
-              <w:spacing w:before="0" w:after="0" w:line="240" w:lineRule="auto"/>
+              <w:spacing w:before="0" w:after="320" w:line="240" w:lineRule="auto"/>
               <w:ind w:firstLine="0"/>
               <w:jc w:val="center"/>
             </w:pPr>

</xml_diff>